<commit_message>
Add reference.docx for docx rendering (Times New Roman, 1.5 spacing, black gothic headings)
Body uses Times New Roman at 1.5 line spacing; headings (levels 1-9) render
black, bold Arial (gothic) instead of the pandoc default themed blue. Wire
--reference-doc into render_docx.ps1 and document it in the demo README.
Regenerate the checked-in demo sample with the new styling.

Co-Authored-By: Claude Opus 4.8 (1M context) <noreply@anthropic.com>
</commit_message>
<xml_diff>
--- a/demo/output/draft.docx
+++ b/demo/output/draft.docx
@@ -269,12 +269,31 @@
       </w:r>
     </w:p>
     <w:bookmarkEnd w:id="15"/>
-    <w:bookmarkStart w:id="16" w:name="discussion"/>
+    <w:bookmarkStart w:id="16" w:name="ここに-demo_flow.drawio-からpngにして追加して"/>
     <w:p>
       <w:pPr>
         <w:pStyle w:val="Heading1"/>
       </w:pPr>
       <w:r>
+        <w:t xml:space="preserve">ここに　demo</w:t>
+      </w:r>
+      <w:r>
+        <w:t xml:space="preserve">_flow.drawio　</w:t>
+      </w:r>
+      <w:r>
+        <w:rPr>
+          <w:rFonts w:hint="eastAsia"/>
+        </w:rPr>
+        <w:t xml:space="preserve">からpngにして追加して</w:t>
+      </w:r>
+    </w:p>
+    <w:bookmarkEnd w:id="16"/>
+    <w:bookmarkStart w:id="17" w:name="discussion"/>
+    <w:p>
+      <w:pPr>
+        <w:pStyle w:val="Heading1"/>
+      </w:pPr>
+      <w:r>
         <w:t xml:space="preserve">Discussion</w:t>
       </w:r>
     </w:p>
@@ -286,8 +305,8 @@
         <w:t xml:space="preserve">AI-assisted writing is most useful when the project files are explicit and the revision target is narrow. For example, asking the AI to revise only the Background section is easier to review than asking it to rewrite the whole manuscript. The researcher remains responsible for the argument, the evidence, and the final wording.</w:t>
       </w:r>
     </w:p>
-    <w:bookmarkEnd w:id="16"/>
-    <w:bookmarkStart w:id="22" w:name="ai-disclosure-example"/>
+    <w:bookmarkEnd w:id="17"/>
+    <w:bookmarkStart w:id="23" w:name="ai-disclosure-example"/>
     <w:p>
       <w:pPr>
         <w:pStyle w:val="Heading1"/>
@@ -304,8 +323,8 @@
         <w:t xml:space="preserve">We used Antigravity 1.18.3 with Claude Opus 4.6 (Anthropic) and/or Gemini 3.1 pro etc. to assist in editing manuscript. All outputs were critically reviewed, executed, and verified by the authors.</w:t>
       </w:r>
     </w:p>
-    <w:bookmarkStart w:id="21" w:name="refs"/>
-    <w:bookmarkStart w:id="18" w:name="ref-page2021prisma"/>
+    <w:bookmarkStart w:id="22" w:name="refs"/>
+    <w:bookmarkStart w:id="19" w:name="ref-page2021prisma"/>
     <w:p>
       <w:pPr>
         <w:pStyle w:val="Bibliography"/>
@@ -335,7 +354,7 @@
       <w:r>
         <w:t xml:space="preserve">. 2021;372:n71. doi:</w:t>
       </w:r>
-      <w:hyperlink r:id="rId17">
+      <w:hyperlink r:id="rId18">
         <w:r>
           <w:rPr>
             <w:rStyle w:val="Hyperlink"/>
@@ -344,8 +363,8 @@
         </w:r>
       </w:hyperlink>
     </w:p>
-    <w:bookmarkEnd w:id="18"/>
-    <w:bookmarkStart w:id="20" w:name="ref-vonelm2007strobe"/>
+    <w:bookmarkEnd w:id="19"/>
+    <w:bookmarkStart w:id="21" w:name="ref-vonelm2007strobe"/>
     <w:p>
       <w:pPr>
         <w:pStyle w:val="Bibliography"/>
@@ -375,7 +394,7 @@
       <w:r>
         <w:t xml:space="preserve">. 2008;61(4):344-349. doi:</w:t>
       </w:r>
-      <w:hyperlink r:id="rId19">
+      <w:hyperlink r:id="rId20">
         <w:r>
           <w:rPr>
             <w:rStyle w:val="Hyperlink"/>
@@ -384,9 +403,9 @@
         </w:r>
       </w:hyperlink>
     </w:p>
-    <w:bookmarkEnd w:id="20"/>
     <w:bookmarkEnd w:id="21"/>
     <w:bookmarkEnd w:id="22"/>
+    <w:bookmarkEnd w:id="23"/>
     <w:sectPr>
       <w:footnotePr>
         <w:numRestart w:val="eachSect"/>
@@ -623,7 +642,7 @@
   <w:docDefaults>
     <w:rPrDefault>
       <w:rPr>
-        <w:rFonts w:asciiTheme="minorHAnsi" w:cstheme="minorBidi" w:eastAsiaTheme="minorEastAsia" w:hAnsiTheme="minorHAnsi"/>
+        <w:rFonts w:ascii="Times New Roman" w:cs="Times New Roman" w:eastAsiaTheme="minorEastAsia" w:hAnsi="Times New Roman"/>
         <w:sz w:val="24"/>
         <w:szCs w:val="24"/>
         <w:lang w:bidi="ar-SA" w:eastAsia="zh-CN" w:val="en-US"/>
@@ -631,7 +650,7 @@
     </w:rPrDefault>
     <w:pPrDefault>
       <w:pPr>
-        <w:spacing w:after="200"/>
+        <w:spacing w:after="200" w:line="360" w:lineRule="auto"/>
       </w:pPr>
     </w:pPrDefault>
   </w:docDefaults>
@@ -677,7 +696,9 @@
       <w:jc w:val="center"/>
     </w:pPr>
     <w:rPr>
-      <w:rFonts w:asciiTheme="majorHAnsi" w:cstheme="majorBidi" w:eastAsiaTheme="majorEastAsia" w:hAnsiTheme="majorHAnsi"/>
+      <w:rFonts w:ascii="Arial" w:cs="Arial" w:eastAsiaTheme="majorEastAsia" w:hAnsi="Arial"/>
+      <w:b/>
+      <w:bCs/>
       <w:sz w:val="56"/>
       <w:szCs w:val="56"/>
     </w:rPr>
@@ -689,7 +710,9 @@
     <w:uiPriority w:val="10"/>
     <w:rsid w:val="00A10FD9"/>
     <w:rPr>
-      <w:rFonts w:asciiTheme="majorHAnsi" w:cstheme="majorBidi" w:eastAsiaTheme="majorEastAsia" w:hAnsiTheme="majorHAnsi"/>
+      <w:rFonts w:ascii="Arial" w:cs="Arial" w:eastAsiaTheme="majorEastAsia" w:hAnsi="Arial"/>
+      <w:b/>
+      <w:bCs/>
       <w:sz w:val="56"/>
       <w:szCs w:val="56"/>
     </w:rPr>
@@ -708,7 +731,9 @@
       </w:numPr>
     </w:pPr>
     <w:rPr>
-      <w:rFonts w:cstheme="majorBidi" w:eastAsiaTheme="majorEastAsia"/>
+      <w:rFonts w:ascii="Arial" w:cs="Arial" w:eastAsiaTheme="majorEastAsia" w:hAnsi="Arial"/>
+      <w:b/>
+      <w:bCs/>
       <w:spacing w:val="15"/>
       <w:sz w:val="28"/>
       <w:szCs w:val="28"/>
@@ -721,7 +746,9 @@
     <w:uiPriority w:val="11"/>
     <w:rsid w:val="00A10FD9"/>
     <w:rPr>
-      <w:rFonts w:cstheme="majorBidi" w:eastAsiaTheme="majorEastAsia"/>
+      <w:rFonts w:ascii="Arial" w:cs="Arial" w:eastAsiaTheme="majorEastAsia" w:hAnsi="Arial"/>
+      <w:b/>
+      <w:bCs/>
       <w:color w:themeColor="text1" w:themeTint="A6" w:val="595959"/>
       <w:spacing w:val="15"/>
       <w:sz w:val="28"/>
@@ -811,8 +838,10 @@
       <w:outlineLvl w:val="0"/>
     </w:pPr>
     <w:rPr>
-      <w:rFonts w:asciiTheme="majorHAnsi" w:cstheme="majorBidi" w:eastAsiaTheme="majorEastAsia" w:hAnsiTheme="majorHAnsi"/>
-      <w:color w:themeColor="accent1" w:themeShade="BF" w:val="0F4761"/>
+      <w:rFonts w:ascii="Arial" w:cs="Arial" w:eastAsiaTheme="majorEastAsia" w:hAnsi="Arial"/>
+      <w:b/>
+      <w:bCs/>
+      <w:color w:val="000000"/>
       <w:sz w:val="40"/>
       <w:szCs w:val="40"/>
     </w:rPr>
@@ -834,8 +863,10 @@
       <w:outlineLvl w:val="1"/>
     </w:pPr>
     <w:rPr>
-      <w:rFonts w:asciiTheme="majorHAnsi" w:cstheme="majorBidi" w:eastAsiaTheme="majorEastAsia" w:hAnsiTheme="majorHAnsi"/>
-      <w:color w:themeColor="accent1" w:themeShade="BF" w:val="0F4761"/>
+      <w:rFonts w:ascii="Arial" w:cs="Arial" w:eastAsiaTheme="majorEastAsia" w:hAnsi="Arial"/>
+      <w:b/>
+      <w:bCs/>
+      <w:color w:val="000000"/>
       <w:sz w:val="32"/>
       <w:szCs w:val="32"/>
     </w:rPr>
@@ -857,8 +888,10 @@
       <w:outlineLvl w:val="2"/>
     </w:pPr>
     <w:rPr>
-      <w:rFonts w:cstheme="majorBidi" w:eastAsiaTheme="majorEastAsia"/>
-      <w:color w:themeColor="accent1" w:themeShade="BF" w:val="0F4761"/>
+      <w:rFonts w:ascii="Arial" w:cs="Arial" w:eastAsiaTheme="majorEastAsia" w:hAnsi="Arial"/>
+      <w:b/>
+      <w:bCs/>
+      <w:color w:val="000000"/>
       <w:sz w:val="28"/>
       <w:szCs w:val="28"/>
     </w:rPr>
@@ -880,10 +913,12 @@
       <w:outlineLvl w:val="3"/>
     </w:pPr>
     <w:rPr>
-      <w:rFonts w:cstheme="majorBidi" w:eastAsiaTheme="majorEastAsia"/>
+      <w:rFonts w:ascii="Arial" w:cs="Arial" w:eastAsiaTheme="majorEastAsia" w:hAnsi="Arial"/>
+      <w:b/>
+      <w:bCs/>
       <w:i/>
       <w:iCs/>
-      <w:color w:themeColor="accent1" w:themeShade="BF" w:val="0F4761"/>
+      <w:color w:val="000000"/>
     </w:rPr>
   </w:style>
   <w:style w:styleId="Heading5" w:type="paragraph">
@@ -903,8 +938,10 @@
       <w:outlineLvl w:val="4"/>
     </w:pPr>
     <w:rPr>
-      <w:rFonts w:cstheme="majorBidi" w:eastAsiaTheme="majorEastAsia"/>
-      <w:color w:themeColor="accent1" w:themeShade="BF" w:val="0F4761"/>
+      <w:rFonts w:ascii="Arial" w:cs="Arial" w:eastAsiaTheme="majorEastAsia" w:hAnsi="Arial"/>
+      <w:b/>
+      <w:bCs/>
+      <w:color w:val="000000"/>
     </w:rPr>
   </w:style>
   <w:style w:styleId="Heading6" w:type="paragraph">
@@ -924,7 +961,9 @@
       <w:outlineLvl w:val="5"/>
     </w:pPr>
     <w:rPr>
-      <w:rFonts w:cstheme="majorBidi" w:eastAsiaTheme="majorEastAsia"/>
+      <w:rFonts w:ascii="Arial" w:cs="Arial" w:eastAsiaTheme="majorEastAsia" w:hAnsi="Arial"/>
+      <w:b/>
+      <w:bCs/>
       <w:i/>
       <w:iCs/>
       <w:color w:themeColor="text1" w:themeTint="A6" w:val="595959"/>
@@ -947,7 +986,9 @@
       <w:outlineLvl w:val="6"/>
     </w:pPr>
     <w:rPr>
-      <w:rFonts w:cstheme="majorBidi" w:eastAsiaTheme="majorEastAsia"/>
+      <w:rFonts w:ascii="Arial" w:cs="Arial" w:eastAsiaTheme="majorEastAsia" w:hAnsi="Arial"/>
+      <w:b/>
+      <w:bCs/>
       <w:color w:themeColor="text1" w:themeTint="A6" w:val="595959"/>
     </w:rPr>
   </w:style>
@@ -968,7 +1009,9 @@
       <w:outlineLvl w:val="7"/>
     </w:pPr>
     <w:rPr>
-      <w:rFonts w:cstheme="majorBidi" w:eastAsiaTheme="majorEastAsia"/>
+      <w:rFonts w:ascii="Arial" w:cs="Arial" w:eastAsiaTheme="majorEastAsia" w:hAnsi="Arial"/>
+      <w:b/>
+      <w:bCs/>
       <w:i/>
       <w:iCs/>
       <w:color w:themeColor="text1" w:themeTint="D8" w:val="272727"/>
@@ -991,7 +1034,9 @@
       <w:outlineLvl w:val="8"/>
     </w:pPr>
     <w:rPr>
-      <w:rFonts w:cstheme="majorBidi" w:eastAsiaTheme="majorEastAsia"/>
+      <w:rFonts w:ascii="Arial" w:cs="Arial" w:eastAsiaTheme="majorEastAsia" w:hAnsi="Arial"/>
+      <w:b/>
+      <w:bCs/>
       <w:color w:themeColor="text1" w:themeTint="D8" w:val="272727"/>
     </w:rPr>
   </w:style>
@@ -1002,8 +1047,10 @@
     <w:uiPriority w:val="9"/>
     <w:rsid w:val="00A10FD9"/>
     <w:rPr>
-      <w:rFonts w:asciiTheme="majorHAnsi" w:cstheme="majorBidi" w:eastAsiaTheme="majorEastAsia" w:hAnsiTheme="majorHAnsi"/>
-      <w:color w:themeColor="accent1" w:themeShade="BF" w:val="0F4761"/>
+      <w:rFonts w:ascii="Arial" w:cs="Arial" w:eastAsiaTheme="majorEastAsia" w:hAnsi="Arial"/>
+      <w:b/>
+      <w:bCs/>
+      <w:color w:val="000000"/>
       <w:sz w:val="40"/>
       <w:szCs w:val="40"/>
     </w:rPr>
@@ -1016,8 +1063,10 @@
     <w:semiHidden/>
     <w:rsid w:val="00A10FD9"/>
     <w:rPr>
-      <w:rFonts w:asciiTheme="majorHAnsi" w:cstheme="majorBidi" w:eastAsiaTheme="majorEastAsia" w:hAnsiTheme="majorHAnsi"/>
-      <w:color w:themeColor="accent1" w:themeShade="BF" w:val="0F4761"/>
+      <w:rFonts w:ascii="Arial" w:cs="Arial" w:eastAsiaTheme="majorEastAsia" w:hAnsi="Arial"/>
+      <w:b/>
+      <w:bCs/>
+      <w:color w:val="000000"/>
       <w:sz w:val="32"/>
       <w:szCs w:val="32"/>
     </w:rPr>
@@ -1030,8 +1079,10 @@
     <w:semiHidden/>
     <w:rsid w:val="00A10FD9"/>
     <w:rPr>
-      <w:rFonts w:cstheme="majorBidi" w:eastAsiaTheme="majorEastAsia"/>
-      <w:color w:themeColor="accent1" w:themeShade="BF" w:val="0F4761"/>
+      <w:rFonts w:ascii="Arial" w:cs="Arial" w:eastAsiaTheme="majorEastAsia" w:hAnsi="Arial"/>
+      <w:b/>
+      <w:bCs/>
+      <w:color w:val="000000"/>
       <w:sz w:val="28"/>
       <w:szCs w:val="28"/>
     </w:rPr>
@@ -1044,10 +1095,12 @@
     <w:semiHidden/>
     <w:rsid w:val="00A10FD9"/>
     <w:rPr>
-      <w:rFonts w:cstheme="majorBidi" w:eastAsiaTheme="majorEastAsia"/>
+      <w:rFonts w:ascii="Arial" w:cs="Arial" w:eastAsiaTheme="majorEastAsia" w:hAnsi="Arial"/>
+      <w:b/>
+      <w:bCs/>
       <w:i/>
       <w:iCs/>
-      <w:color w:themeColor="accent1" w:themeShade="BF" w:val="0F4761"/>
+      <w:color w:val="000000"/>
     </w:rPr>
   </w:style>
   <w:style w:customStyle="1" w:styleId="Heading5Char" w:type="character">
@@ -1058,8 +1111,10 @@
     <w:semiHidden/>
     <w:rsid w:val="00A10FD9"/>
     <w:rPr>
-      <w:rFonts w:cstheme="majorBidi" w:eastAsiaTheme="majorEastAsia"/>
-      <w:color w:themeColor="accent1" w:themeShade="BF" w:val="0F4761"/>
+      <w:rFonts w:ascii="Arial" w:cs="Arial" w:eastAsiaTheme="majorEastAsia" w:hAnsi="Arial"/>
+      <w:b/>
+      <w:bCs/>
+      <w:color w:val="000000"/>
     </w:rPr>
   </w:style>
   <w:style w:customStyle="1" w:styleId="Heading6Char" w:type="character">
@@ -1070,7 +1125,9 @@
     <w:semiHidden/>
     <w:rsid w:val="00A10FD9"/>
     <w:rPr>
-      <w:rFonts w:cstheme="majorBidi" w:eastAsiaTheme="majorEastAsia"/>
+      <w:rFonts w:ascii="Arial" w:cs="Arial" w:eastAsiaTheme="majorEastAsia" w:hAnsi="Arial"/>
+      <w:b/>
+      <w:bCs/>
       <w:i/>
       <w:iCs/>
       <w:color w:themeColor="text1" w:themeTint="A6" w:val="595959"/>
@@ -1084,7 +1141,9 @@
     <w:semiHidden/>
     <w:rsid w:val="00A10FD9"/>
     <w:rPr>
-      <w:rFonts w:cstheme="majorBidi" w:eastAsiaTheme="majorEastAsia"/>
+      <w:rFonts w:ascii="Arial" w:cs="Arial" w:eastAsiaTheme="majorEastAsia" w:hAnsi="Arial"/>
+      <w:b/>
+      <w:bCs/>
       <w:color w:themeColor="text1" w:themeTint="A6" w:val="595959"/>
     </w:rPr>
   </w:style>
@@ -1096,7 +1155,9 @@
     <w:semiHidden/>
     <w:rsid w:val="00A10FD9"/>
     <w:rPr>
-      <w:rFonts w:cstheme="majorBidi" w:eastAsiaTheme="majorEastAsia"/>
+      <w:rFonts w:ascii="Arial" w:cs="Arial" w:eastAsiaTheme="majorEastAsia" w:hAnsi="Arial"/>
+      <w:b/>
+      <w:bCs/>
       <w:i/>
       <w:iCs/>
       <w:color w:themeColor="text1" w:themeTint="D8" w:val="272727"/>
@@ -1110,7 +1171,9 @@
     <w:semiHidden/>
     <w:rsid w:val="00A10FD9"/>
     <w:rPr>
-      <w:rFonts w:cstheme="majorBidi" w:eastAsiaTheme="majorEastAsia"/>
+      <w:rFonts w:ascii="Arial" w:cs="Arial" w:eastAsiaTheme="majorEastAsia" w:hAnsi="Arial"/>
+      <w:b/>
+      <w:bCs/>
       <w:color w:themeColor="text1" w:themeTint="D8" w:val="272727"/>
     </w:rPr>
   </w:style>

</xml_diff>